<commit_message>
test: restore green baseline - regen goldens to current corpus, ruff format gate
</commit_message>
<xml_diff>
--- a/backend/tests/fixtures/import_native.docx
+++ b/backend/tests/fixtures/import_native.docx
@@ -126,92 +126,66 @@
         </w:rPr>
         <w:t xml:space="preserve">[0002]　行内公式 </w:t>
       </w:r>
-      <m:oMath>
+      <m:oMath xmlns:mml="http://www.w3.org/1998/Math/MathML">
         <m:sSub>
-          <m:sSubPr/>
           <m:e>
             <m:r>
-              <m:rPr/>
               <w:rPr>
                 <w:rFonts w:ascii="Cambria Math" w:hAnsi="Cambria Math" w:eastAsia="宋体"/>
                 <w:sz w:val="24"/>
                 <w:szCs w:val="24"/>
               </w:rPr>
-              <m:t xml:space="preserve">a</m:t>
+              <m:t>a</m:t>
             </m:r>
           </m:e>
           <m:sub>
             <m:r>
-              <m:rPr/>
               <w:rPr>
                 <w:rFonts w:ascii="Cambria Math" w:hAnsi="Cambria Math" w:eastAsia="宋体"/>
                 <w:sz w:val="24"/>
                 <w:szCs w:val="24"/>
               </w:rPr>
-              <m:t xml:space="preserve">i</m:t>
+              <m:t>i</m:t>
             </m:r>
           </m:sub>
         </m:sSub>
         <m:r>
-          <m:rPr/>
           <w:rPr>
             <w:rFonts w:ascii="Cambria Math" w:hAnsi="Cambria Math" w:eastAsia="宋体"/>
             <w:sz w:val="24"/>
             <w:szCs w:val="24"/>
           </w:rPr>
-          <m:t xml:space="preserve"> </m:t>
-        </m:r>
-        <m:r>
-          <m:rPr/>
-          <w:rPr>
-            <w:rFonts w:ascii="Cambria Math" w:hAnsi="Cambria Math" w:eastAsia="宋体"/>
-            <w:sz w:val="24"/>
-            <w:szCs w:val="24"/>
-          </w:rPr>
-          <m:t xml:space="preserve">=</m:t>
-        </m:r>
-        <m:r>
-          <m:rPr/>
-          <w:rPr>
-            <w:rFonts w:ascii="Cambria Math" w:hAnsi="Cambria Math" w:eastAsia="宋体"/>
-            <w:sz w:val="24"/>
-            <w:szCs w:val="24"/>
-          </w:rPr>
-          <m:t xml:space="preserve"> </m:t>
+          <m:t>=</m:t>
         </m:r>
         <m:sSubSup>
-          <m:sSubSupPr/>
           <m:e>
             <m:r>
-              <m:rPr/>
               <w:rPr>
                 <w:rFonts w:ascii="Cambria Math" w:hAnsi="Cambria Math" w:eastAsia="宋体"/>
                 <w:sz w:val="24"/>
                 <w:szCs w:val="24"/>
               </w:rPr>
-              <m:t xml:space="preserve">b</m:t>
+              <m:t>b</m:t>
             </m:r>
           </m:e>
           <m:sub>
             <m:r>
-              <m:rPr/>
               <w:rPr>
                 <w:rFonts w:ascii="Cambria Math" w:hAnsi="Cambria Math" w:eastAsia="宋体"/>
                 <w:sz w:val="24"/>
                 <w:szCs w:val="24"/>
               </w:rPr>
-              <m:t xml:space="preserve">i</m:t>
+              <m:t>i</m:t>
             </m:r>
           </m:sub>
           <m:sup>
             <m:r>
-              <m:rPr/>
               <w:rPr>
                 <w:rFonts w:ascii="Cambria Math" w:hAnsi="Cambria Math" w:eastAsia="宋体"/>
                 <w:sz w:val="24"/>
                 <w:szCs w:val="24"/>
               </w:rPr>
-              <m:t xml:space="preserve">2</m:t>
+              <m:t>2</m:t>
             </m:r>
           </m:sup>
         </m:sSubSup>
@@ -316,141 +290,75 @@
             <w:tcW w:type="dxa" w:w="2880"/>
           </w:tcPr>
           <w:p>
-            <m:oMath>
+            <m:oMath xmlns:mml="http://www.w3.org/1998/Math/MathML">
               <m:r>
-                <m:rPr/>
                 <w:rPr>
                   <w:rFonts w:ascii="Cambria Math" w:hAnsi="Cambria Math" w:eastAsia="宋体"/>
                   <w:sz w:val="24"/>
                   <w:szCs w:val="24"/>
                 </w:rPr>
-                <m:t xml:space="preserve">E </m:t>
+                <m:t>E=</m:t>
               </m:r>
+              <m:sSub>
+                <m:e>
+                  <m:r>
+                    <w:rPr>
+                      <w:rFonts w:ascii="Cambria Math" w:hAnsi="Cambria Math" w:eastAsia="宋体"/>
+                      <w:sz w:val="24"/>
+                      <w:szCs w:val="24"/>
+                    </w:rPr>
+                    <m:t>Σ</m:t>
+                  </m:r>
+                </m:e>
+                <m:sub>
+                  <m:r>
+                    <w:rPr>
+                      <w:rFonts w:ascii="Cambria Math" w:hAnsi="Cambria Math" w:eastAsia="宋体"/>
+                      <w:sz w:val="24"/>
+                      <w:szCs w:val="24"/>
+                    </w:rPr>
+                    <m:t>i∈S</m:t>
+                  </m:r>
+                </m:sub>
+              </m:sSub>
               <m:r>
-                <m:rPr/>
                 <w:rPr>
                   <w:rFonts w:ascii="Cambria Math" w:hAnsi="Cambria Math" w:eastAsia="宋体"/>
                   <w:sz w:val="24"/>
                   <w:szCs w:val="24"/>
                 </w:rPr>
-                <m:t xml:space="preserve">=</m:t>
+                <m:t>(</m:t>
               </m:r>
+              <m:sSub>
+                <m:e>
+                  <m:r>
+                    <w:rPr>
+                      <w:rFonts w:ascii="Cambria Math" w:hAnsi="Cambria Math" w:eastAsia="宋体"/>
+                      <w:sz w:val="24"/>
+                      <w:szCs w:val="24"/>
+                    </w:rPr>
+                    <m:t>x</m:t>
+                  </m:r>
+                </m:e>
+                <m:sub>
+                  <m:r>
+                    <w:rPr>
+                      <w:rFonts w:ascii="Cambria Math" w:hAnsi="Cambria Math" w:eastAsia="宋体"/>
+                      <w:sz w:val="24"/>
+                      <w:szCs w:val="24"/>
+                    </w:rPr>
+                    <m:t>i</m:t>
+                  </m:r>
+                </m:sub>
+              </m:sSub>
               <m:r>
-                <m:rPr/>
                 <w:rPr>
                   <w:rFonts w:ascii="Cambria Math" w:hAnsi="Cambria Math" w:eastAsia="宋体"/>
                   <w:sz w:val="24"/>
                   <w:szCs w:val="24"/>
                 </w:rPr>
-                <m:t xml:space="preserve"> </m:t>
+                <m:t>−μ)/n</m:t>
               </m:r>
-              <m:nary>
-                <m:naryPr>
-                  <m:chr m:val="∑"/>
-                  <m:limLoc m:val="undOvr"/>
-                  <m:supHide m:val="1"/>
-                </m:naryPr>
-                <m:sub>
-                  <m:r>
-                    <m:rPr/>
-                    <w:rPr>
-                      <w:rFonts w:ascii="Cambria Math" w:hAnsi="Cambria Math" w:eastAsia="宋体"/>
-                      <w:sz w:val="24"/>
-                      <w:szCs w:val="24"/>
-                    </w:rPr>
-                    <m:t xml:space="preserve">i</m:t>
-                  </m:r>
-                  <m:r>
-                    <m:rPr/>
-                    <w:rPr>
-                      <w:rFonts w:ascii="Cambria Math" w:hAnsi="Cambria Math" w:eastAsia="宋体"/>
-                      <w:sz w:val="24"/>
-                      <w:szCs w:val="24"/>
-                    </w:rPr>
-                    <m:t xml:space="preserve">∈</m:t>
-                  </m:r>
-                  <m:r>
-                    <m:rPr/>
-                    <w:rPr>
-                      <w:rFonts w:ascii="Cambria Math" w:hAnsi="Cambria Math" w:eastAsia="宋体"/>
-                      <w:sz w:val="24"/>
-                      <w:szCs w:val="24"/>
-                    </w:rPr>
-                    <m:t xml:space="preserve">S</m:t>
-                  </m:r>
-                </m:sub>
-                <m:sup/>
-                <m:e>
-                  <m:f>
-                    <m:fPr/>
-                    <m:num>
-                      <m:sSub>
-                        <m:sSubPr/>
-                        <m:e>
-                          <m:r>
-                            <m:rPr/>
-                            <w:rPr>
-                              <w:rFonts w:ascii="Cambria Math" w:hAnsi="Cambria Math" w:eastAsia="宋体"/>
-                              <w:sz w:val="24"/>
-                              <w:szCs w:val="24"/>
-                            </w:rPr>
-                            <m:t xml:space="preserve">x</m:t>
-                          </m:r>
-                        </m:e>
-                        <m:sub>
-                          <m:r>
-                            <m:rPr/>
-                            <w:rPr>
-                              <w:rFonts w:ascii="Cambria Math" w:hAnsi="Cambria Math" w:eastAsia="宋体"/>
-                              <w:sz w:val="24"/>
-                              <w:szCs w:val="24"/>
-                            </w:rPr>
-                            <m:t xml:space="preserve">i</m:t>
-                          </m:r>
-                        </m:sub>
-                      </m:sSub>
-                      <m:r>
-                        <m:rPr/>
-                        <w:rPr>
-                          <w:rFonts w:ascii="Cambria Math" w:hAnsi="Cambria Math" w:eastAsia="宋体"/>
-                          <w:sz w:val="24"/>
-                          <w:szCs w:val="24"/>
-                        </w:rPr>
-                        <m:t xml:space="preserve"> </m:t>
-                      </m:r>
-                      <m:r>
-                        <m:rPr/>
-                        <w:rPr>
-                          <w:rFonts w:ascii="Cambria Math" w:hAnsi="Cambria Math" w:eastAsia="宋体"/>
-                          <w:sz w:val="24"/>
-                          <w:szCs w:val="24"/>
-                        </w:rPr>
-                        <m:t xml:space="preserve">−</m:t>
-                      </m:r>
-                      <m:r>
-                        <m:rPr/>
-                        <w:rPr>
-                          <w:rFonts w:ascii="Cambria Math" w:hAnsi="Cambria Math" w:eastAsia="宋体"/>
-                          <w:sz w:val="24"/>
-                          <w:szCs w:val="24"/>
-                        </w:rPr>
-                        <m:t xml:space="preserve"> μ</m:t>
-                      </m:r>
-                    </m:num>
-                    <m:den>
-                      <m:r>
-                        <m:rPr/>
-                        <w:rPr>
-                          <w:rFonts w:ascii="Cambria Math" w:hAnsi="Cambria Math" w:eastAsia="宋体"/>
-                          <w:sz w:val="24"/>
-                          <w:szCs w:val="24"/>
-                        </w:rPr>
-                        <m:t xml:space="preserve">n</m:t>
-                      </m:r>
-                    </m:den>
-                  </m:f>
-                </m:e>
-              </m:nary>
             </m:oMath>
           </w:p>
         </w:tc>

</xml_diff>